<commit_message>
Add student name Parth Bhardwaj and Roll No 2301730289 across all deliverables
</commit_message>
<xml_diff>
--- a/legal_technical_report/operation_phantom_swipe_report.docx
+++ b/legal_technical_report/operation_phantom_swipe_report.docx
@@ -44,6 +44,15 @@
           <w:sz w:val="19"/>
         </w:rPr>
         <w:t>Investigating Authority: Digital Forensics &amp; Cyber Crime Division, Central Bureau of Investigation</w:t>
+      </w:r>
+    </w:p>
+    <w:p>
+      <w:r>
+        <w:rPr>
+          <w:color w:val="2D3748"/>
+          <w:sz w:val="19"/>
+        </w:rPr>
+        <w:t>Lead Investigator / Author: Parth Bhardwaj (Roll No: 2301730289)</w:t>
       </w:r>
     </w:p>
     <w:p>
@@ -2269,7 +2278,7 @@
           <w:color w:val="2D3748"/>
           <w:sz w:val="19"/>
         </w:rPr>
-        <w:t>Lead Forensic Examiner: Inspr. S. Sharma</w:t>
+        <w:t>Lead Forensic Examiner: Parth Bhardwaj (Roll No: 2301730289)</w:t>
       </w:r>
     </w:p>
     <w:p>
@@ -2278,7 +2287,7 @@
           <w:color w:val="2D3748"/>
           <w:sz w:val="19"/>
         </w:rPr>
-        <w:t>Signature: S. Sharma</w:t>
+        <w:t>Signature: Parth Bhardwaj</w:t>
       </w:r>
     </w:p>
     <w:p>

</xml_diff>